<commit_message>
feat(docx): support registered templates and dynamic context
</commit_message>
<xml_diff>
--- a/meetasr/export/templates/docx/minimal.docx
+++ b/meetasr/export/templates/docx/minimal.docx
@@ -21,19 +21,8 @@
         <w:t>Ngày tạo: {{ generated_at }}</w:t>
       </w:r>
     </w:p>
-    <w:p/>
     <w:p>
-      <w:pPr>
-        <w:rPr>
-          <w:rFonts w:cs="Times New Roman"/>
-          <w:szCs w:val="26"/>
-        </w:rPr>
-      </w:pPr>
       <w:r>
-        <w:rPr>
-          <w:rFonts w:cs="Times New Roman"/>
-          <w:szCs w:val="26"/>
-        </w:rPr>
         <w:t>{{p body }}</w:t>
       </w:r>
     </w:p>
@@ -50,6 +39,45 @@
 <file path=word/numbering.xml><?xml version="1.0" encoding="utf-8"?>
 <w:numbering xmlns:wpc="http://schemas.microsoft.com/office/word/2010/wordprocessingCanvas" xmlns:cx="http://schemas.microsoft.com/office/drawing/2014/chartex" xmlns:cx1="http://schemas.microsoft.com/office/drawing/2015/9/8/chartex" xmlns:cx2="http://schemas.microsoft.com/office/drawing/2015/10/21/chartex" xmlns:cx3="http://schemas.microsoft.com/office/drawing/2016/5/9/chartex" xmlns:cx4="http://schemas.microsoft.com/office/drawing/2016/5/10/chartex" xmlns:cx5="http://schemas.microsoft.com/office/drawing/2016/5/11/chartex" xmlns:cx6="http://schemas.microsoft.com/office/drawing/2016/5/12/chartex" xmlns:cx7="http://schemas.microsoft.com/office/drawing/2016/5/13/chartex" xmlns:cx8="http://schemas.microsoft.com/office/drawing/2016/5/14/chartex" xmlns:mc="http://schemas.openxmlformats.org/markup-compatibility/2006" xmlns:aink="http://schemas.microsoft.com/office/drawing/2016/ink" xmlns:am3d="http://schemas.microsoft.com/office/drawing/2017/model3d" xmlns:o="urn:schemas-microsoft-com:office:office" xmlns:oel="http://schemas.microsoft.com/office/2019/extlst" xmlns:r="http://schemas.openxmlformats.org/officeDocument/2006/relationships" xmlns:m="http://schemas.openxmlformats.org/officeDocument/2006/math" xmlns:v="urn:schemas-microsoft-com:vml" xmlns:wp14="http://schemas.microsoft.com/office/word/2010/wordprocessingDrawing" xmlns:wp="http://schemas.openxmlformats.org/drawingml/2006/wordprocessingDrawing" xmlns:w10="urn:schemas-microsoft-com:office:word" xmlns:w="http://schemas.openxmlformats.org/wordprocessingml/2006/main" xmlns:w14="http://schemas.microsoft.com/office/word/2010/wordml" xmlns:w15="http://schemas.microsoft.com/office/word/2012/wordml" xmlns:w16cex="http://schemas.microsoft.com/office/word/2018/wordml/cex" xmlns:w16cid="http://schemas.microsoft.com/office/word/2016/wordml/cid" xmlns:w16="http://schemas.microsoft.com/office/word/2018/wordml" xmlns:w16du="http://schemas.microsoft.com/office/word/2023/wordml/word16du" xmlns:w16sdtdh="http://schemas.microsoft.com/office/word/2020/wordml/sdtdatahash" xmlns:w16sdtfl="http://schemas.microsoft.com/office/word/2024/wordml/sdtformatlock" xmlns:w16se="http://schemas.microsoft.com/office/word/2015/wordml/symex" xmlns:wpg="http://schemas.microsoft.com/office/word/2010/wordprocessingGroup" xmlns:wpi="http://schemas.microsoft.com/office/word/2010/wordprocessingInk" xmlns:wne="http://schemas.microsoft.com/office/word/2006/wordml" xmlns:wps="http://schemas.microsoft.com/office/word/2010/wordprocessingShape" mc:Ignorable="w14 w15 w16se w16cid w16 w16cex w16sdtdh w16sdtfl w16du wp14">
   <w:abstractNum w:abstractNumId="0" w15:restartNumberingAfterBreak="0">
+    <w:nsid w:val="FFFFFF88"/>
+    <w:multiLevelType w:val="singleLevel"/>
+    <w:tmpl w:val="18783A40"/>
+    <w:lvl w:ilvl="0">
+      <w:start w:val="1"/>
+      <w:numFmt w:val="decimal"/>
+      <w:pStyle w:val="ListNumber"/>
+      <w:lvlText w:val="%1."/>
+      <w:lvlJc w:val="left"/>
+      <w:pPr>
+        <w:tabs>
+          <w:tab w:val="num" w:pos="360"/>
+        </w:tabs>
+        <w:ind w:left="360" w:hanging="360"/>
+      </w:pPr>
+    </w:lvl>
+  </w:abstractNum>
+  <w:abstractNum w:abstractNumId="1" w15:restartNumberingAfterBreak="0">
+    <w:nsid w:val="FFFFFF89"/>
+    <w:multiLevelType w:val="singleLevel"/>
+    <w:tmpl w:val="C840DF0E"/>
+    <w:lvl w:ilvl="0">
+      <w:start w:val="1"/>
+      <w:numFmt w:val="bullet"/>
+      <w:pStyle w:val="ListBullet"/>
+      <w:lvlText w:val=""/>
+      <w:lvlJc w:val="left"/>
+      <w:pPr>
+        <w:tabs>
+          <w:tab w:val="num" w:pos="360"/>
+        </w:tabs>
+        <w:ind w:left="360" w:hanging="360"/>
+      </w:pPr>
+      <w:rPr>
+        <w:rFonts w:ascii="Symbol" w:hAnsi="Symbol" w:hint="default"/>
+      </w:rPr>
+    </w:lvl>
+  </w:abstractNum>
+  <w:abstractNum w:abstractNumId="2" w15:restartNumberingAfterBreak="0">
     <w:nsid w:val="11F940A3"/>
     <w:multiLevelType w:val="hybridMultilevel"/>
     <w:tmpl w:val="E6A03CE6"/>
@@ -162,19 +190,19 @@
       </w:rPr>
     </w:lvl>
   </w:abstractNum>
-  <w:abstractNum w:abstractNumId="1" w15:restartNumberingAfterBreak="0">
+  <w:abstractNum w:abstractNumId="3" w15:restartNumberingAfterBreak="0">
     <w:nsid w:val="68041C7D"/>
     <w:multiLevelType w:val="multilevel"/>
-    <w:tmpl w:val="0D1EAA10"/>
+    <w:tmpl w:val="0AE2DC9E"/>
     <w:lvl w:ilvl="0">
       <w:start w:val="1"/>
-      <w:numFmt w:val="decimal"/>
+      <w:numFmt w:val="none"/>
       <w:pStyle w:val="Heading1"/>
-      <w:suff w:val="space"/>
-      <w:lvlText w:val="%1."/>
+      <w:suff w:val="nothing"/>
+      <w:lvlText w:val="%1"/>
       <w:lvlJc w:val="left"/>
       <w:pPr>
-        <w:ind w:left="432" w:hanging="432"/>
+        <w:ind w:left="0" w:firstLine="0"/>
       </w:pPr>
       <w:rPr>
         <w:rFonts w:ascii="Times New Roman" w:hAnsi="Times New Roman" w:hint="default"/>
@@ -186,13 +214,13 @@
     </w:lvl>
     <w:lvl w:ilvl="1">
       <w:start w:val="4"/>
-      <w:numFmt w:val="decimal"/>
+      <w:numFmt w:val="none"/>
       <w:pStyle w:val="Heading2"/>
-      <w:suff w:val="space"/>
-      <w:lvlText w:val="%1.%2."/>
+      <w:suff w:val="nothing"/>
+      <w:lvlText w:val="%1"/>
       <w:lvlJc w:val="left"/>
       <w:pPr>
-        <w:ind w:left="576" w:hanging="576"/>
+        <w:ind w:left="0" w:firstLine="0"/>
       </w:pPr>
       <w:rPr>
         <w:rFonts w:ascii="Times New Roman" w:hAnsi="Times New Roman" w:hint="default"/>
@@ -203,12 +231,13 @@
     </w:lvl>
     <w:lvl w:ilvl="2">
       <w:start w:val="1"/>
-      <w:numFmt w:val="decimal"/>
+      <w:numFmt w:val="none"/>
       <w:pStyle w:val="Heading3"/>
-      <w:lvlText w:val="%1.%2.%3."/>
+      <w:suff w:val="nothing"/>
+      <w:lvlText w:val="%1"/>
       <w:lvlJc w:val="left"/>
       <w:pPr>
-        <w:ind w:left="720" w:hanging="720"/>
+        <w:ind w:left="0" w:firstLine="0"/>
       </w:pPr>
       <w:rPr>
         <w:rFonts w:ascii="Times New Roman" w:hAnsi="Times New Roman" w:hint="default"/>
@@ -220,13 +249,13 @@
     </w:lvl>
     <w:lvl w:ilvl="3">
       <w:start w:val="1"/>
-      <w:numFmt w:val="decimal"/>
+      <w:numFmt w:val="none"/>
       <w:pStyle w:val="Heading4"/>
-      <w:suff w:val="space"/>
-      <w:lvlText w:val="%1.%2.%3.%4."/>
+      <w:suff w:val="nothing"/>
+      <w:lvlText w:val="%1"/>
       <w:lvlJc w:val="left"/>
       <w:pPr>
-        <w:ind w:left="144" w:hanging="144"/>
+        <w:ind w:left="0" w:firstLine="0"/>
       </w:pPr>
       <w:rPr>
         <w:rFonts w:ascii="Times New Roman" w:hAnsi="Times New Roman" w:hint="default"/>
@@ -241,7 +270,7 @@
       <w:lvlText w:val="%1.%2.%3.%4.%5."/>
       <w:lvlJc w:val="left"/>
       <w:pPr>
-        <w:ind w:left="2232" w:hanging="792"/>
+        <w:ind w:left="0" w:firstLine="0"/>
       </w:pPr>
       <w:rPr>
         <w:rFonts w:hint="default"/>
@@ -253,7 +282,7 @@
       <w:lvlText w:val="%1.%2.%3.%4.%5.%6."/>
       <w:lvlJc w:val="left"/>
       <w:pPr>
-        <w:ind w:left="2736" w:hanging="936"/>
+        <w:ind w:left="0" w:firstLine="0"/>
       </w:pPr>
       <w:rPr>
         <w:rFonts w:hint="default"/>
@@ -265,7 +294,7 @@
       <w:lvlText w:val="%1.%2.%3.%4.%5.%6.%7."/>
       <w:lvlJc w:val="left"/>
       <w:pPr>
-        <w:ind w:left="3240" w:hanging="1080"/>
+        <w:ind w:left="0" w:firstLine="0"/>
       </w:pPr>
       <w:rPr>
         <w:rFonts w:hint="default"/>
@@ -277,7 +306,7 @@
       <w:lvlText w:val="%1.%2.%3.%4.%5.%6.%7.%8."/>
       <w:lvlJc w:val="left"/>
       <w:pPr>
-        <w:ind w:left="3744" w:hanging="1224"/>
+        <w:ind w:left="0" w:firstLine="0"/>
       </w:pPr>
       <w:rPr>
         <w:rFonts w:hint="default"/>
@@ -289,7 +318,7 @@
       <w:lvlText w:val="%1.%2.%3.%4.%5.%6.%7.%8.%9."/>
       <w:lvlJc w:val="left"/>
       <w:pPr>
-        <w:ind w:left="4320" w:hanging="1440"/>
+        <w:ind w:left="0" w:firstLine="0"/>
       </w:pPr>
       <w:rPr>
         <w:rFonts w:hint="default"/>
@@ -297,18 +326,24 @@
     </w:lvl>
   </w:abstractNum>
   <w:num w:numId="1" w16cid:durableId="544099132">
+    <w:abstractNumId w:val="3"/>
+  </w:num>
+  <w:num w:numId="2" w16cid:durableId="975178481">
+    <w:abstractNumId w:val="3"/>
+  </w:num>
+  <w:num w:numId="3" w16cid:durableId="659892471">
+    <w:abstractNumId w:val="3"/>
+  </w:num>
+  <w:num w:numId="4" w16cid:durableId="1984305854">
+    <w:abstractNumId w:val="3"/>
+  </w:num>
+  <w:num w:numId="5" w16cid:durableId="1795097770">
+    <w:abstractNumId w:val="2"/>
+  </w:num>
+  <w:num w:numId="6" w16cid:durableId="38750765">
     <w:abstractNumId w:val="1"/>
   </w:num>
-  <w:num w:numId="2" w16cid:durableId="975178481">
-    <w:abstractNumId w:val="1"/>
-  </w:num>
-  <w:num w:numId="3" w16cid:durableId="659892471">
-    <w:abstractNumId w:val="1"/>
-  </w:num>
-  <w:num w:numId="4" w16cid:durableId="1984305854">
-    <w:abstractNumId w:val="1"/>
-  </w:num>
-  <w:num w:numId="5" w16cid:durableId="1795097770">
+  <w:num w:numId="7" w16cid:durableId="275449349">
     <w:abstractNumId w:val="0"/>
   </w:num>
 </w:numbering>
@@ -714,9 +749,9 @@
   <w:style w:type="paragraph" w:default="1" w:styleId="Normal">
     <w:name w:val="Normal"/>
     <w:qFormat/>
-    <w:rsid w:val="001A735A"/>
-    <w:pPr>
-      <w:spacing w:after="120" w:line="276" w:lineRule="auto"/>
+    <w:rsid w:val="00DB5878"/>
+    <w:pPr>
+      <w:spacing w:line="276" w:lineRule="auto"/>
       <w:jc w:val="both"/>
     </w:pPr>
     <w:rPr>
@@ -727,38 +762,36 @@
   </w:style>
   <w:style w:type="paragraph" w:styleId="Heading1">
     <w:name w:val="heading 1"/>
-    <w:basedOn w:val="Normal"/>
     <w:next w:val="Normal"/>
     <w:link w:val="Heading1Char"/>
     <w:uiPriority w:val="9"/>
     <w:qFormat/>
-    <w:rsid w:val="0012584C"/>
+    <w:rsid w:val="00903E34"/>
     <w:pPr>
       <w:keepNext/>
       <w:keepLines/>
       <w:numPr>
         <w:numId w:val="4"/>
       </w:numPr>
-      <w:spacing w:before="120"/>
-      <w:ind w:left="0" w:firstLine="0"/>
+      <w:spacing w:before="480"/>
       <w:outlineLvl w:val="0"/>
     </w:pPr>
     <w:rPr>
-      <w:rFonts w:eastAsiaTheme="majorEastAsia" w:cstheme="majorBidi"/>
+      <w:rFonts w:ascii="Times New Roman" w:eastAsiaTheme="majorEastAsia" w:hAnsi="Times New Roman" w:cstheme="majorBidi"/>
       <w:b/>
-      <w:sz w:val="28"/>
+      <w:color w:val="000000" w:themeColor="text1"/>
+      <w:sz w:val="32"/>
       <w:szCs w:val="40"/>
     </w:rPr>
   </w:style>
   <w:style w:type="paragraph" w:styleId="Heading2">
     <w:name w:val="heading 2"/>
-    <w:basedOn w:val="Normal"/>
     <w:next w:val="Normal"/>
     <w:link w:val="Heading2Char"/>
     <w:uiPriority w:val="9"/>
     <w:unhideWhenUsed/>
     <w:qFormat/>
-    <w:rsid w:val="0012584C"/>
+    <w:rsid w:val="00903E34"/>
     <w:pPr>
       <w:keepNext/>
       <w:keepLines/>
@@ -766,26 +799,25 @@
         <w:ilvl w:val="1"/>
         <w:numId w:val="4"/>
       </w:numPr>
-      <w:spacing w:before="120" w:after="60"/>
-      <w:ind w:left="0" w:firstLine="0"/>
+      <w:spacing w:before="360" w:after="120"/>
       <w:outlineLvl w:val="1"/>
     </w:pPr>
     <w:rPr>
-      <w:rFonts w:eastAsiaTheme="majorEastAsia" w:cstheme="majorBidi"/>
+      <w:rFonts w:ascii="Times New Roman" w:eastAsiaTheme="majorEastAsia" w:hAnsi="Times New Roman" w:cstheme="majorBidi"/>
       <w:b/>
+      <w:color w:val="000000" w:themeColor="text1"/>
       <w:sz w:val="28"/>
       <w:szCs w:val="32"/>
     </w:rPr>
   </w:style>
   <w:style w:type="paragraph" w:styleId="Heading3">
     <w:name w:val="heading 3"/>
-    <w:basedOn w:val="Normal"/>
     <w:next w:val="Normal"/>
     <w:link w:val="Heading3Char"/>
     <w:uiPriority w:val="9"/>
     <w:unhideWhenUsed/>
     <w:qFormat/>
-    <w:rsid w:val="0012584C"/>
+    <w:rsid w:val="00903E34"/>
     <w:pPr>
       <w:keepNext/>
       <w:keepLines/>
@@ -793,13 +825,14 @@
         <w:ilvl w:val="2"/>
         <w:numId w:val="4"/>
       </w:numPr>
-      <w:spacing w:before="120"/>
-      <w:ind w:left="0" w:firstLine="0"/>
+      <w:spacing w:before="240" w:after="80"/>
       <w:outlineLvl w:val="2"/>
     </w:pPr>
     <w:rPr>
-      <w:rFonts w:eastAsiaTheme="majorEastAsia" w:cstheme="majorBidi"/>
+      <w:rFonts w:ascii="Times New Roman" w:eastAsiaTheme="majorEastAsia" w:hAnsi="Times New Roman" w:cstheme="majorBidi"/>
       <w:i/>
+      <w:color w:val="000000" w:themeColor="text1"/>
+      <w:sz w:val="26"/>
       <w:szCs w:val="28"/>
     </w:rPr>
   </w:style>
@@ -817,7 +850,7 @@
       <w:keepLines/>
       <w:numPr>
         <w:ilvl w:val="3"/>
-        <w:numId w:val="1"/>
+        <w:numId w:val="4"/>
       </w:numPr>
       <w:spacing w:before="80" w:after="40"/>
       <w:outlineLvl w:val="3"/>
@@ -941,6 +974,7 @@
   <w:style w:type="character" w:default="1" w:styleId="DefaultParagraphFont">
     <w:name w:val="Default Paragraph Font"/>
     <w:uiPriority w:val="1"/>
+    <w:semiHidden/>
     <w:unhideWhenUsed/>
   </w:style>
   <w:style w:type="table" w:default="1" w:styleId="TableNormal">
@@ -969,12 +1003,12 @@
     <w:basedOn w:val="DefaultParagraphFont"/>
     <w:link w:val="Heading1"/>
     <w:uiPriority w:val="9"/>
-    <w:rsid w:val="0012584C"/>
+    <w:rsid w:val="00903E34"/>
     <w:rPr>
       <w:rFonts w:ascii="Times New Roman" w:eastAsiaTheme="majorEastAsia" w:hAnsi="Times New Roman" w:cstheme="majorBidi"/>
       <w:b/>
       <w:color w:val="000000" w:themeColor="text1"/>
-      <w:sz w:val="28"/>
+      <w:sz w:val="32"/>
       <w:szCs w:val="40"/>
     </w:rPr>
   </w:style>
@@ -983,7 +1017,7 @@
     <w:basedOn w:val="DefaultParagraphFont"/>
     <w:link w:val="Heading2"/>
     <w:uiPriority w:val="9"/>
-    <w:rsid w:val="0012584C"/>
+    <w:rsid w:val="00903E34"/>
     <w:rPr>
       <w:rFonts w:ascii="Times New Roman" w:eastAsiaTheme="majorEastAsia" w:hAnsi="Times New Roman" w:cstheme="majorBidi"/>
       <w:b/>
@@ -997,7 +1031,7 @@
     <w:basedOn w:val="DefaultParagraphFont"/>
     <w:link w:val="Heading3"/>
     <w:uiPriority w:val="9"/>
-    <w:rsid w:val="0012584C"/>
+    <w:rsid w:val="00903E34"/>
     <w:rPr>
       <w:rFonts w:ascii="Times New Roman" w:eastAsiaTheme="majorEastAsia" w:hAnsi="Times New Roman" w:cstheme="majorBidi"/>
       <w:i/>
@@ -1024,24 +1058,17 @@
     <w:basedOn w:val="Normal"/>
     <w:link w:val="paraChar"/>
     <w:qFormat/>
-    <w:rsid w:val="00303EC7"/>
-    <w:pPr>
-      <w:spacing w:before="60" w:after="60" w:line="360" w:lineRule="auto"/>
-      <w:ind w:left="432" w:firstLine="432"/>
-    </w:pPr>
-    <w:rPr>
-      <w:sz w:val="28"/>
-    </w:rPr>
+    <w:rsid w:val="00DB5878"/>
   </w:style>
   <w:style w:type="character" w:customStyle="1" w:styleId="paraChar">
     <w:name w:val="para Char"/>
     <w:basedOn w:val="DefaultParagraphFont"/>
     <w:link w:val="para"/>
-    <w:rsid w:val="00303EC7"/>
+    <w:rsid w:val="00DB5878"/>
     <w:rPr>
       <w:rFonts w:ascii="Times New Roman" w:hAnsi="Times New Roman"/>
       <w:color w:val="000000" w:themeColor="text1"/>
-      <w:sz w:val="28"/>
+      <w:sz w:val="26"/>
     </w:rPr>
   </w:style>
   <w:style w:type="character" w:customStyle="1" w:styleId="Heading5Char">
@@ -1110,23 +1137,23 @@
   </w:style>
   <w:style w:type="paragraph" w:styleId="Title">
     <w:name w:val="Title"/>
-    <w:basedOn w:val="Normal"/>
     <w:next w:val="Normal"/>
     <w:link w:val="TitleChar"/>
     <w:uiPriority w:val="10"/>
     <w:qFormat/>
-    <w:rsid w:val="0012584C"/>
+    <w:rsid w:val="00893608"/>
     <w:pPr>
       <w:spacing w:after="80" w:line="240" w:lineRule="auto"/>
       <w:contextualSpacing/>
       <w:jc w:val="center"/>
     </w:pPr>
     <w:rPr>
-      <w:rFonts w:eastAsiaTheme="majorEastAsia" w:cstheme="majorBidi"/>
+      <w:rFonts w:ascii="Times New Roman" w:eastAsiaTheme="majorEastAsia" w:hAnsi="Times New Roman" w:cstheme="majorBidi"/>
       <w:b/>
+      <w:color w:val="000000" w:themeColor="text1"/>
       <w:spacing w:val="-10"/>
       <w:kern w:val="28"/>
-      <w:sz w:val="32"/>
+      <w:sz w:val="40"/>
       <w:szCs w:val="56"/>
     </w:rPr>
   </w:style>
@@ -1135,14 +1162,14 @@
     <w:basedOn w:val="DefaultParagraphFont"/>
     <w:link w:val="Title"/>
     <w:uiPriority w:val="10"/>
-    <w:rsid w:val="0012584C"/>
+    <w:rsid w:val="00893608"/>
     <w:rPr>
       <w:rFonts w:ascii="Times New Roman" w:eastAsiaTheme="majorEastAsia" w:hAnsi="Times New Roman" w:cstheme="majorBidi"/>
       <w:b/>
       <w:color w:val="000000" w:themeColor="text1"/>
       <w:spacing w:val="-10"/>
       <w:kern w:val="28"/>
-      <w:sz w:val="32"/>
+      <w:sz w:val="40"/>
       <w:szCs w:val="56"/>
     </w:rPr>
   </w:style>
@@ -1736,6 +1763,36 @@
         </w:tcBorders>
       </w:tcPr>
     </w:tblStylePr>
+  </w:style>
+  <w:style w:type="paragraph" w:styleId="ListBullet">
+    <w:name w:val="List Bullet"/>
+    <w:basedOn w:val="Normal"/>
+    <w:uiPriority w:val="99"/>
+    <w:semiHidden/>
+    <w:unhideWhenUsed/>
+    <w:rsid w:val="00AA3915"/>
+    <w:pPr>
+      <w:numPr>
+        <w:numId w:val="6"/>
+      </w:numPr>
+      <w:spacing w:after="60"/>
+      <w:contextualSpacing/>
+    </w:pPr>
+  </w:style>
+  <w:style w:type="paragraph" w:styleId="ListNumber">
+    <w:name w:val="List Number"/>
+    <w:basedOn w:val="Normal"/>
+    <w:uiPriority w:val="99"/>
+    <w:semiHidden/>
+    <w:unhideWhenUsed/>
+    <w:rsid w:val="00AA3915"/>
+    <w:pPr>
+      <w:numPr>
+        <w:numId w:val="7"/>
+      </w:numPr>
+      <w:spacing w:after="60"/>
+      <w:contextualSpacing/>
+    </w:pPr>
   </w:style>
 </w:styles>
 </file>

</xml_diff>